<commit_message>
Complete deliverables with identity and schema drift controls
</commit_message>
<xml_diff>
--- a/deliverables/Amazon_Q2_2026_Assessment_Brief.docx
+++ b/deliverables/Amazon_Q2_2026_Assessment_Brief.docx
@@ -431,7 +431,7 @@
           <w:rFonts w:ascii="Calibri" w:hAnsi="Calibri"/>
           <w:color w:val="111827"/>
         </w:rPr>
-        <w:t>The recommended production path is BigQuery with dbt or Dataform. Raw inputs remain immutable; finance-facing marts are published only after identity, arithmetic, completeness, and reconciliation checks pass. Databricks can demonstrate the same medallion pattern if the company already operates a lakehouse.</w:t>
+        <w:t>Use one BigQuery Bronze-Silver-Gold business model with two deployment choices. The efficient path uses native Google Cloud serverless ingestion, Dataform, and Connected Sheets/Looker Studio. The premium path uses managed ELT, dbt Cloud, managed observability, and Looker. Raw evidence, keys, facts, tests, and reporting definitions remain portable between them.</w:t>
       </w:r>
     </w:p>
     <w:tbl>
@@ -660,7 +660,7 @@
                 <w:color w:val="111827"/>
                 <w:sz w:val="18"/>
               </w:rPr>
-              <w:t>Typed, renamed, deduplicated source-shaped views</w:t>
+              <w:t>Typed, renamed source-shaped views with explicit replay rules</w:t>
             </w:r>
           </w:p>
         </w:tc>
@@ -1705,7 +1705,7 @@
           <w:rFonts w:ascii="Calibri" w:hAnsi="Calibri"/>
           <w:color w:val="111827"/>
         </w:rPr>
-        <w:t>Use the supplied SKU mapping as authoritative. Resolve alternate SKUs and ASINs through an effective-dated identifier bridge; do not rewrite historical facts. Prefix inference (GT, PF, PH) is a monitored fallback only. The actual Peak Fuel prefix in the files is PF, not PK.</w:t>
+        <w:t>Use exact approved SKU first, then approved alias, then unique marketplace-scoped ASIN. Prefix inference (GT, PF, PH) may establish brand only and never invents a product key. Store product, brand, and ASIN confidence separately; quarantine conflicts. The actual Peak Fuel prefix is PF, not PK.</w:t>
       </w:r>
     </w:p>
     <w:p>
@@ -1774,7 +1774,7 @@
           <w:rFonts w:ascii="Calibri" w:hAnsi="Calibri"/>
           <w:color w:val="111827"/>
         </w:rPr>
-        <w:t>Test schema, types, accepted values, date coverage, and freshness at ingestion.</w:t>
+        <w:t>Snapshot every observed schema/hash; warn on optional additions and block required-field or type/mode changes.</w:t>
       </w:r>
     </w:p>
     <w:p>
@@ -1827,34 +1827,14 @@
           <w:b/>
           <w:color w:val="111827"/>
         </w:rPr>
-        <w:t xml:space="preserve">Completeness. </w:t>
+        <w:t xml:space="preserve">Completeness / ownership. </w:t>
       </w:r>
       <w:r>
         <w:rPr>
           <w:rFonts w:ascii="Calibri" w:hAnsi="Calibri"/>
           <w:color w:val="111827"/>
         </w:rPr>
-        <w:t>Require product and cost coverage; classify unallocated charges but never silently drop them.</w:t>
-      </w:r>
-    </w:p>
-    <w:p>
-      <w:pPr>
-        <w:spacing w:after="60" w:line="264" w:lineRule="auto"/>
-      </w:pPr>
-      <w:r>
-        <w:rPr>
-          <w:rFonts w:ascii="Calibri" w:hAnsi="Calibri"/>
-          <w:b/>
-          <w:color w:val="111827"/>
-        </w:rPr>
-        <w:t xml:space="preserve">Ownership. </w:t>
-      </w:r>
-      <w:r>
-        <w:rPr>
-          <w:rFonts w:ascii="Calibri" w:hAnsi="Calibri"/>
-          <w:color w:val="111827"/>
-        </w:rPr>
-        <w:t>Write failures to an exception table with severity, source row, first seen, owner, status, and resolution.</w:t>
+        <w:t>Require product and cost coverage; write failures to an exception table with severity, source row, owner, status, and resolution.</w:t>
       </w:r>
     </w:p>
     <w:p>
@@ -5371,7 +5351,7 @@
           <w:rFonts w:ascii="Calibri" w:hAnsi="Calibri"/>
           <w:color w:val="111827"/>
         </w:rPr>
-        <w:t>The sequence follows dependency order: controlled source delivery first, close and management reporting second, and forward-looking inventory/ad decisions third.</w:t>
+        <w:t>The sequence is the same under either platform option: control source delivery first, automate the management P&amp;L second, and add inventory/ad actions third.</w:t>
       </w:r>
     </w:p>
     <w:tbl>
@@ -5521,7 +5501,7 @@
                 <w:color w:val="111827"/>
                 <w:sz w:val="18"/>
               </w:rPr>
-              <w:t>Scheduled QuickBooks, REACH, Amazon, and Sheet ingestion; immutable raw files; product/UOM/alias governance; freshness, schema, duplicate, and reconciliation tests.</w:t>
+              <w:t>Schedule QuickBooks, REACH, Amazon, and Sheet loads; immutable replayable Bronze data; identity/UOM governance; schema-drift, dedup, freshness, and amount gates.</w:t>
             </w:r>
           </w:p>
         </w:tc>
@@ -5546,7 +5526,7 @@
                 <w:color w:val="111827"/>
                 <w:sz w:val="18"/>
               </w:rPr>
-              <w:t>Prevents scaled errors. Output: daily source-control dashboard and owned exception queue.</w:t>
+              <w:t>Daily source-control dashboard, drift alerts, and owned exception queue.</w:t>
             </w:r>
           </w:p>
         </w:tc>
@@ -5600,7 +5580,7 @@
                 <w:color w:val="111827"/>
                 <w:sz w:val="18"/>
               </w:rPr>
-              <w:t>Marketplace transaction, landed-cost, inventory, advertising, and GL facts; daily/monthly SKU CM; Amazon cash and fee reconciliation to QuickBooks; Connected Sheets outputs.</w:t>
+              <w:t>Build Silver facts and Gold brand/SKU CM; reconcile Amazon settlements to QuickBooks; replace copy/paste reporting.</w:t>
             </w:r>
           </w:p>
         </w:tc>
@@ -5626,7 +5606,7 @@
                 <w:color w:val="111827"/>
                 <w:sz w:val="18"/>
               </w:rPr>
-              <w:t>Removes highest-value recurring work. Output: close-ready channel P&amp;L and settlement-to-GL reconciliation.</w:t>
+              <w:t>Close-ready channel P&amp;L and settlement-to-GL reconciliation.</w:t>
             </w:r>
           </w:p>
         </w:tc>
@@ -5678,7 +5658,7 @@
                 <w:color w:val="111827"/>
                 <w:sz w:val="18"/>
               </w:rPr>
-              <w:t>REACH PO lifecycle and receipts; inbound ETA; days cover, stockout, excess/aging, and cash-at-risk alerts; campaign/SKU ad attribution; forecast refresh and close SLAs.</w:t>
+              <w:t>Add REACH PO lifecycle/receipts, inventory alerts, campaign-SKU spend, and 13-week cash/inventory outlook.</w:t>
             </w:r>
           </w:p>
         </w:tc>
@@ -5703,7 +5683,7 @@
                 <w:color w:val="111827"/>
                 <w:sz w:val="18"/>
               </w:rPr>
-              <w:t>Turns trusted history into action. Output: inventory/action dashboard and 13-week cash/inventory outlook.</w:t>
+              <w:t>Forward-looking actions grounded in controlled facts.</w:t>
             </w:r>
           </w:p>
         </w:tc>
@@ -5720,97 +5700,271 @@
         <w:keepNext/>
       </w:pPr>
       <w:r>
-        <w:t>Success measures by day 90</w:t>
+        <w:t>Two implementation paths</w:t>
       </w:r>
     </w:p>
+    <w:tbl>
+      <w:tblPr>
+        <w:tblStyle w:val="TableGrid"/>
+        <w:tblW w:type="dxa" w:w="9360"/>
+        <w:tblLayout w:type="fixed"/>
+        <w:tblLook w:firstColumn="1" w:firstRow="1" w:lastColumn="0" w:lastRow="0" w:noHBand="0" w:noVBand="1" w:val="04A0"/>
+        <w:jc w:val="left"/>
+        <w:tblInd w:w="120" w:type="dxa"/>
+      </w:tblPr>
+      <w:tblGrid>
+        <w:gridCol w:w="1900"/>
+        <w:gridCol w:w="4300"/>
+        <w:gridCol w:w="3160"/>
+      </w:tblGrid>
+      <w:tr>
+        <w:trPr>
+          <w:tblHeader w:val="true"/>
+        </w:trPr>
+        <w:tc>
+          <w:tcPr>
+            <w:tcW w:type="dxa" w:w="1900"/>
+            <w:tcMar>
+              <w:top w:w="80" w:type="dxa"/>
+              <w:start w:w="120" w:type="dxa"/>
+              <w:bottom w:w="80" w:type="dxa"/>
+              <w:end w:w="120" w:type="dxa"/>
+            </w:tcMar>
+            <w:vAlign w:val="center"/>
+            <w:shd w:fill="0B2545"/>
+          </w:tcPr>
+          <w:p>
+            <w:pPr>
+              <w:spacing w:after="0"/>
+            </w:pPr>
+            <w:r>
+              <w:rPr>
+                <w:rFonts w:ascii="Calibri" w:hAnsi="Calibri"/>
+                <w:b/>
+                <w:color w:val="FFFFFF"/>
+                <w:sz w:val="18"/>
+              </w:rPr>
+              <w:t>Path</w:t>
+            </w:r>
+          </w:p>
+        </w:tc>
+        <w:tc>
+          <w:tcPr>
+            <w:tcW w:type="dxa" w:w="4300"/>
+            <w:tcMar>
+              <w:top w:w="80" w:type="dxa"/>
+              <w:start w:w="120" w:type="dxa"/>
+              <w:bottom w:w="80" w:type="dxa"/>
+              <w:end w:w="120" w:type="dxa"/>
+            </w:tcMar>
+            <w:vAlign w:val="center"/>
+            <w:shd w:fill="0B2545"/>
+          </w:tcPr>
+          <w:p>
+            <w:pPr>
+              <w:spacing w:after="0"/>
+            </w:pPr>
+            <w:r>
+              <w:rPr>
+                <w:rFonts w:ascii="Calibri" w:hAnsi="Calibri"/>
+                <w:b/>
+                <w:color w:val="FFFFFF"/>
+                <w:sz w:val="18"/>
+              </w:rPr>
+              <w:t>Ingestion / medallion stack</w:t>
+            </w:r>
+          </w:p>
+        </w:tc>
+        <w:tc>
+          <w:tcPr>
+            <w:tcW w:type="dxa" w:w="3160"/>
+            <w:tcMar>
+              <w:top w:w="80" w:type="dxa"/>
+              <w:start w:w="120" w:type="dxa"/>
+              <w:bottom w:w="80" w:type="dxa"/>
+              <w:end w:w="120" w:type="dxa"/>
+            </w:tcMar>
+            <w:vAlign w:val="center"/>
+            <w:shd w:fill="0B2545"/>
+          </w:tcPr>
+          <w:p>
+            <w:pPr>
+              <w:spacing w:after="0"/>
+            </w:pPr>
+            <w:r>
+              <w:rPr>
+                <w:rFonts w:ascii="Calibri" w:hAnsi="Calibri"/>
+                <w:b/>
+                <w:color w:val="FFFFFF"/>
+                <w:sz w:val="18"/>
+              </w:rPr>
+              <w:t>Tradeoff</w:t>
+            </w:r>
+          </w:p>
+        </w:tc>
+      </w:tr>
+      <w:tr>
+        <w:tc>
+          <w:tcPr>
+            <w:tcW w:type="dxa" w:w="1900"/>
+            <w:tcMar>
+              <w:top w:w="80" w:type="dxa"/>
+              <w:start w:w="120" w:type="dxa"/>
+              <w:bottom w:w="80" w:type="dxa"/>
+              <w:end w:w="120" w:type="dxa"/>
+            </w:tcMar>
+            <w:vAlign w:val="center"/>
+          </w:tcPr>
+          <w:p>
+            <w:pPr>
+              <w:spacing w:after="0"/>
+            </w:pPr>
+            <w:r>
+              <w:rPr>
+                <w:rFonts w:ascii="Calibri" w:hAnsi="Calibri"/>
+                <w:color w:val="111827"/>
+                <w:sz w:val="18"/>
+              </w:rPr>
+              <w:t>Efficient / cost-aware</w:t>
+            </w:r>
+          </w:p>
+        </w:tc>
+        <w:tc>
+          <w:tcPr>
+            <w:tcW w:type="dxa" w:w="4300"/>
+            <w:tcMar>
+              <w:top w:w="80" w:type="dxa"/>
+              <w:start w:w="120" w:type="dxa"/>
+              <w:bottom w:w="80" w:type="dxa"/>
+              <w:end w:w="120" w:type="dxa"/>
+            </w:tcMar>
+            <w:vAlign w:val="center"/>
+          </w:tcPr>
+          <w:p>
+            <w:pPr>
+              <w:spacing w:after="0"/>
+            </w:pPr>
+            <w:r>
+              <w:rPr>
+                <w:rFonts w:ascii="Calibri" w:hAnsi="Calibri"/>
+                <w:color w:val="111827"/>
+                <w:sz w:val="18"/>
+              </w:rPr>
+              <w:t>Cloud Run + Workflows; GCS/BigQuery Bronze; Dataform Silver/Gold; Connected Sheets + Looker Studio</w:t>
+            </w:r>
+          </w:p>
+        </w:tc>
+        <w:tc>
+          <w:tcPr>
+            <w:tcW w:type="dxa" w:w="3160"/>
+            <w:tcMar>
+              <w:top w:w="80" w:type="dxa"/>
+              <w:start w:w="120" w:type="dxa"/>
+              <w:bottom w:w="80" w:type="dxa"/>
+              <w:end w:w="120" w:type="dxa"/>
+            </w:tcMar>
+            <w:vAlign w:val="center"/>
+          </w:tcPr>
+          <w:p>
+            <w:pPr>
+              <w:spacing w:after="0"/>
+            </w:pPr>
+            <w:r>
+              <w:rPr>
+                <w:rFonts w:ascii="Calibri" w:hAnsi="Calibri"/>
+                <w:color w:val="111827"/>
+                <w:sz w:val="18"/>
+              </w:rPr>
+              <w:t>Recommended start: lower recurring software cost; team owns connector maintenance.</w:t>
+            </w:r>
+          </w:p>
+        </w:tc>
+      </w:tr>
+      <w:tr>
+        <w:tc>
+          <w:tcPr>
+            <w:tcW w:type="dxa" w:w="1900"/>
+            <w:shd w:fill="F2F4F7"/>
+            <w:tcMar>
+              <w:top w:w="80" w:type="dxa"/>
+              <w:start w:w="120" w:type="dxa"/>
+              <w:bottom w:w="80" w:type="dxa"/>
+              <w:end w:w="120" w:type="dxa"/>
+            </w:tcMar>
+            <w:vAlign w:val="center"/>
+          </w:tcPr>
+          <w:p>
+            <w:pPr>
+              <w:spacing w:after="0"/>
+            </w:pPr>
+            <w:r>
+              <w:rPr>
+                <w:rFonts w:ascii="Calibri" w:hAnsi="Calibri"/>
+                <w:color w:val="111827"/>
+                <w:sz w:val="18"/>
+              </w:rPr>
+              <w:t>Premium / managed</w:t>
+            </w:r>
+          </w:p>
+        </w:tc>
+        <w:tc>
+          <w:tcPr>
+            <w:tcW w:type="dxa" w:w="4300"/>
+            <w:shd w:fill="F2F4F7"/>
+            <w:tcMar>
+              <w:top w:w="80" w:type="dxa"/>
+              <w:start w:w="120" w:type="dxa"/>
+              <w:bottom w:w="80" w:type="dxa"/>
+              <w:end w:w="120" w:type="dxa"/>
+            </w:tcMar>
+            <w:vAlign w:val="center"/>
+          </w:tcPr>
+          <w:p>
+            <w:pPr>
+              <w:spacing w:after="0"/>
+            </w:pPr>
+            <w:r>
+              <w:rPr>
+                <w:rFonts w:ascii="Calibri" w:hAnsi="Calibri"/>
+                <w:color w:val="111827"/>
+                <w:sz w:val="18"/>
+              </w:rPr>
+              <w:t>Managed Amazon/QuickBooks ELT; BigQuery Bronze; dbt Cloud Silver/Gold; managed observability + Looker</w:t>
+            </w:r>
+          </w:p>
+        </w:tc>
+        <w:tc>
+          <w:tcPr>
+            <w:tcW w:type="dxa" w:w="3160"/>
+            <w:shd w:fill="F2F4F7"/>
+            <w:tcMar>
+              <w:top w:w="80" w:type="dxa"/>
+              <w:start w:w="120" w:type="dxa"/>
+              <w:bottom w:w="80" w:type="dxa"/>
+              <w:end w:w="120" w:type="dxa"/>
+            </w:tcMar>
+            <w:vAlign w:val="center"/>
+          </w:tcPr>
+          <w:p>
+            <w:pPr>
+              <w:spacing w:after="0"/>
+            </w:pPr>
+            <w:r>
+              <w:rPr>
+                <w:rFonts w:ascii="Calibri" w:hAnsi="Calibri"/>
+                <w:color w:val="111827"/>
+                <w:sz w:val="18"/>
+              </w:rPr>
+              <w:t>Faster rollout and stronger operations; higher subscription cost and vendor dependence.</w:t>
+            </w:r>
+          </w:p>
+        </w:tc>
+      </w:tr>
+    </w:tbl>
     <w:p>
       <w:pPr>
-        <w:spacing w:after="80" w:line="264" w:lineRule="auto"/>
+        <w:spacing w:after="40"/>
       </w:pPr>
-      <w:r>
-        <w:rPr>
-          <w:rFonts w:ascii="Calibri" w:hAnsi="Calibri"/>
-          <w:b/>
-          <w:color w:val="111827"/>
-        </w:rPr>
-        <w:t xml:space="preserve">Reliability. </w:t>
-      </w:r>
-      <w:r>
-        <w:rPr>
-          <w:rFonts w:ascii="Calibri" w:hAnsi="Calibri"/>
-          <w:color w:val="111827"/>
-        </w:rPr>
-        <w:t>95%+ automated source delivery and test pass rate; every material exception has an owner and aging.</w:t>
-      </w:r>
-    </w:p>
-    <w:p>
-      <w:pPr>
-        <w:spacing w:after="80" w:line="264" w:lineRule="auto"/>
-      </w:pPr>
-      <w:r>
-        <w:rPr>
-          <w:rFonts w:ascii="Calibri" w:hAnsi="Calibri"/>
-          <w:b/>
-          <w:color w:val="111827"/>
-        </w:rPr>
-        <w:t xml:space="preserve">Coverage. </w:t>
-      </w:r>
-      <w:r>
-        <w:rPr>
-          <w:rFonts w:ascii="Calibri" w:hAnsi="Calibri"/>
-          <w:color w:val="111827"/>
-        </w:rPr>
-        <w:t>100% sold-SKU identity coverage and 98%+ landed-cost coverage.</w:t>
-      </w:r>
-    </w:p>
-    <w:p>
-      <w:pPr>
-        <w:spacing w:after="80" w:line="264" w:lineRule="auto"/>
-      </w:pPr>
-      <w:r>
-        <w:rPr>
-          <w:rFonts w:ascii="Calibri" w:hAnsi="Calibri"/>
-          <w:b/>
-          <w:color w:val="111827"/>
-        </w:rPr>
-        <w:t xml:space="preserve">Close. </w:t>
-      </w:r>
-      <w:r>
-        <w:rPr>
-          <w:rFonts w:ascii="Calibri" w:hAnsi="Calibri"/>
-          <w:color w:val="111827"/>
-        </w:rPr>
-        <w:t>Marketplace-to-QuickBooks reconciliation within a documented tolerance and at least 50% less report-preparation time.</w:t>
-      </w:r>
-    </w:p>
-    <w:p>
-      <w:pPr>
-        <w:spacing w:after="80" w:line="264" w:lineRule="auto"/>
-      </w:pPr>
-      <w:r>
-        <w:rPr>
-          <w:rFonts w:ascii="Calibri" w:hAnsi="Calibri"/>
-          <w:b/>
-          <w:color w:val="111827"/>
-        </w:rPr>
-        <w:t xml:space="preserve">Decision quality. </w:t>
-      </w:r>
-      <w:r>
-        <w:rPr>
-          <w:rFonts w:ascii="Calibri" w:hAnsi="Calibri"/>
-          <w:color w:val="111827"/>
-        </w:rPr>
-        <w:t>SKU ad attribution and inventory alerts are traceable to source facts and approved mappings.</w:t>
-      </w:r>
-    </w:p>
-    <w:p>
-      <w:pPr>
-        <w:pStyle w:val="Heading2"/>
-        <w:keepNext/>
-      </w:pPr>
-      <w:r>
-        <w:t>Platform and demonstration recommendation</w:t>
-      </w:r>
     </w:p>
     <w:tbl>
       <w:tblPr>
@@ -5846,14 +6000,14 @@
                 <w:b/>
                 <w:color w:val="0B2545"/>
               </w:rPr>
-              <w:t xml:space="preserve">Recommended production path: </w:t>
+              <w:t xml:space="preserve">Recommendation: </w:t>
             </w:r>
             <w:r>
               <w:rPr>
                 <w:rFonts w:ascii="Calibri" w:hAnsi="Calibri"/>
                 <w:color w:val="0B2545"/>
               </w:rPr>
-              <w:t>BigQuery + dbt/Dataform + Connected Sheets or Looker Studio. It is the most natural low-operations fit for a finance team already using Google Sheets.</w:t>
+              <w:t>Start cost-aware unless connector reliability and implementation speed justify managed ELT. Keep the same Bronze-Silver-Gold contracts so components can be upgraded without redesigning finance logic.</w:t>
             </w:r>
           </w:p>
         </w:tc>
@@ -5871,9 +6025,17 @@
       <w:r>
         <w:rPr>
           <w:rFonts w:ascii="Calibri" w:hAnsi="Calibri"/>
+          <w:b/>
           <w:color w:val="111827"/>
         </w:rPr>
-        <w:t>Use GitHub to show code, lineage, tests, and reviewability. Use a short Databricks notebook only as an optional live demonstration if the interview panel values lakehouse architecture. Lead with reconciled economics and controls rather than the platform.</w:t>
+        <w:t xml:space="preserve">Success measures. </w:t>
+      </w:r>
+      <w:r>
+        <w:rPr>
+          <w:rFonts w:ascii="Calibri" w:hAnsi="Calibri"/>
+          <w:color w:val="111827"/>
+        </w:rPr>
+        <w:t>Day-90 targets: 95%+ scheduled-feed reliability; 99.5%+ of net sales with A-grade product/brand identity; Amazon-to-QuickBooks reconciliation within tolerance; at least 50% less recurring report preparation.</w:t>
       </w:r>
     </w:p>
     <w:p>

</xml_diff>

<commit_message>
Simplify assessment narrative and add review visuals
</commit_message>
<xml_diff>
--- a/deliverables/Amazon_Q2_2026_Assessment_Brief.docx
+++ b/deliverables/Amazon_Q2_2026_Assessment_Brief.docx
@@ -106,7 +106,7 @@
           <w:color w:val="111827"/>
           <w:sz w:val="21"/>
         </w:rPr>
-        <w:t xml:space="preserve">Submission: </w:t>
+        <w:t xml:space="preserve">Files included: </w:t>
       </w:r>
       <w:r>
         <w:rPr>
@@ -114,7 +114,7 @@
           <w:color w:val="111827"/>
           <w:sz w:val="21"/>
         </w:rPr>
-        <w:t>GitHub-ready code; BigQuery production design; Databricks demo option</w:t>
+        <w:t>Workbook, written response, presentation, Python, SQL, and optional Databricks demo</w:t>
       </w:r>
     </w:p>
     <w:tbl>
@@ -151,14 +151,14 @@
                 <w:b/>
                 <w:color w:val="0B2545"/>
               </w:rPr>
-              <w:t xml:space="preserve">Executive answer: </w:t>
+              <w:t xml:space="preserve">Main result: </w:t>
             </w:r>
             <w:r>
               <w:rPr>
                 <w:rFonts w:ascii="Calibri" w:hAnsi="Calibri"/>
                 <w:color w:val="0B2545"/>
               </w:rPr>
-              <w:t>SKU-attributable contribution margin is $51.2K (38.7% of net sales after promotions). Advertising, storage, and subscription charges lack SKU keys and are therefore shown below CM1; including them and two adjustments produces an estimated $5.5K loss after platform overhead.</w:t>
+              <w:t>SKU-attributable contribution margin is $51.2K (38.7% of net sales after promotions). Advertising, storage, and subscription charges lack SKU keys and are therefore shown separately; including them and two adjustments produces an estimated $5.5K loss after platform costs.</w:t>
             </w:r>
           </w:p>
         </w:tc>
@@ -240,7 +240,7 @@
                 <w:color w:val="FFFFFF"/>
                 <w:sz w:val="18"/>
               </w:rPr>
-              <w:t>CM1</w:t>
+              <w:t>Contribution margin</w:t>
             </w:r>
           </w:p>
         </w:tc>
@@ -268,7 +268,7 @@
                 <w:color w:val="FFFFFF"/>
                 <w:sz w:val="18"/>
               </w:rPr>
-              <w:t>CM1 %</w:t>
+              <w:t>Margin %</w:t>
             </w:r>
           </w:p>
         </w:tc>
@@ -296,7 +296,7 @@
                 <w:color w:val="FFFFFF"/>
                 <w:sz w:val="18"/>
               </w:rPr>
-              <w:t>After platform overhead</w:t>
+              <w:t>After platform costs</w:t>
             </w:r>
           </w:p>
         </w:tc>
@@ -419,7 +419,7 @@
         <w:keepNext/>
       </w:pPr>
       <w:r>
-        <w:t>1. Data model: controlled layers, stable identities</w:t>
+        <w:t>1. Proposed data model</w:t>
       </w:r>
     </w:p>
     <w:p>
@@ -431,7 +431,7 @@
           <w:rFonts w:ascii="Calibri" w:hAnsi="Calibri"/>
           <w:color w:val="111827"/>
         </w:rPr>
-        <w:t>Use one BigQuery Bronze-Silver-Gold business model with two deployment choices. The efficient path uses native Google Cloud serverless ingestion, Dataform, and Connected Sheets/Looker Studio. The premium path uses managed ELT, dbt Cloud, managed observability, and Looker. Raw evidence, keys, facts, tests, and reporting definitions remain portable between them.</w:t>
+        <w:t>I would use one BigQuery model with separate raw, staging, core, and reporting layers. The lower-cost option uses Google Cloud ingestion, Dataform, and Connected Sheets or Looker Studio. The managed option buys Amazon and QuickBooks connectors, dbt Cloud, monitoring, and Looker. The tables and finance definitions stay the same in either option.</w:t>
       </w:r>
     </w:p>
     <w:tbl>
@@ -1754,7 +1754,7 @@
         <w:keepNext/>
       </w:pPr>
       <w:r>
-        <w:t>Data quality as an operating process</w:t>
+        <w:t>How I would keep the data reliable</w:t>
       </w:r>
     </w:p>
     <w:p>
@@ -1888,7 +1888,7 @@
                 <w:rFonts w:ascii="Calibri" w:hAnsi="Calibri"/>
                 <w:color w:val="0B2545"/>
               </w:rPr>
-              <w:t>CM1 = product sales net of refunds - promotional deductions - referral fees - FBA fulfillment fees - landed COGS.</w:t>
+              <w:t>Contribution margin = product sales net of refunds - promotional deductions - referral fees - FBA fulfillment fees - landed COGS.</w:t>
             </w:r>
           </w:p>
         </w:tc>
@@ -2318,7 +2318,7 @@
                 <w:color w:val="111827"/>
                 <w:sz w:val="18"/>
               </w:rPr>
-              <w:t>Contribution margin (CM1)</w:t>
+              <w:t>Contribution margin</w:t>
             </w:r>
           </w:p>
         </w:tc>
@@ -2588,7 +2588,7 @@
                 <w:color w:val="111827"/>
                 <w:sz w:val="18"/>
               </w:rPr>
-              <w:t>Profit after platform overhead</w:t>
+              <w:t>Result after platform costs</w:t>
             </w:r>
           </w:p>
         </w:tc>
@@ -2753,7 +2753,7 @@
                 <w:color w:val="FFFFFF"/>
                 <w:sz w:val="18"/>
               </w:rPr>
-              <w:t>CM1</w:t>
+              <w:t>Contribution</w:t>
             </w:r>
           </w:p>
         </w:tc>
@@ -2781,7 +2781,7 @@
                 <w:color w:val="FFFFFF"/>
                 <w:sz w:val="18"/>
               </w:rPr>
-              <w:t>CM1 %</w:t>
+              <w:t>Margin %</w:t>
             </w:r>
           </w:p>
         </w:tc>
@@ -3216,7 +3216,7 @@
           <w:rFonts w:ascii="Calibri" w:hAnsi="Calibri"/>
           <w:color w:val="111827"/>
         </w:rPr>
-        <w:t>Order and Refund rows are in CM1. Refunds reverse sales, promotions, referral fees, units, and landed COGS; return disposition was not provided. FBA fee reversals are used exactly as reported (none appear on refund rows).</w:t>
+        <w:t>Order and Refund rows are included. Refunds reverse sales, promotions, referral fees, units, and landed COGS; return disposition was not provided. FBA fee reversals are used exactly as reported (none appear on refund rows).</w:t>
       </w:r>
     </w:p>
     <w:p>
@@ -3256,7 +3256,7 @@
           <w:rFonts w:ascii="Calibri" w:hAnsi="Calibri"/>
           <w:color w:val="111827"/>
         </w:rPr>
-        <w:t>Advertising, storage, subscription, and adjustments remain below CM1 because the supplied file lacks a causal SKU key. No arbitrary allocation was used.</w:t>
+        <w:t>Advertising, storage, subscription, and adjustments are shown after contribution margin because the supplied file lacks a reliable SKU key. No arbitrary allocation was used.</w:t>
       </w:r>
     </w:p>
     <w:p>
@@ -3404,7 +3404,7 @@
                 <w:color w:val="FFFFFF"/>
                 <w:sz w:val="18"/>
               </w:rPr>
-              <w:t>CM1</w:t>
+              <w:t>Contribution</w:t>
             </w:r>
           </w:p>
         </w:tc>
@@ -3432,7 +3432,7 @@
                 <w:color w:val="FFFFFF"/>
                 <w:sz w:val="18"/>
               </w:rPr>
-              <w:t>CM1 %</w:t>
+              <w:t>Margin %</w:t>
             </w:r>
           </w:p>
         </w:tc>
@@ -4120,7 +4120,7 @@
           <w:rFonts w:ascii="Calibri" w:hAnsi="Calibri"/>
           <w:color w:val="111827"/>
         </w:rPr>
-        <w:t>GT-SERUM-VITC is the largest SKU contributor at $7.5K CM1 and 54.8%. PF-WHEY-CHOC contributes $6.6K. Protect in-stock rates and ad efficiency on these proven contributors.</w:t>
+        <w:t>GT-SERUM-VITC is the largest SKU contributor at $7.5K and a 54.8% margin. PF-WHEY-CHOC contributes $6.6K. Protect in-stock rates and ad efficiency on these proven contributors.</w:t>
       </w:r>
     </w:p>
     <w:p>
@@ -4229,7 +4229,7 @@
                 <w:color w:val="FFFFFF"/>
                 <w:sz w:val="18"/>
               </w:rPr>
-              <w:t>CM1</w:t>
+              <w:t>Contribution</w:t>
             </w:r>
           </w:p>
         </w:tc>
@@ -4257,7 +4257,7 @@
                 <w:color w:val="FFFFFF"/>
                 <w:sz w:val="18"/>
               </w:rPr>
-              <w:t>CM1 %</w:t>
+              <w:t>Margin %</w:t>
             </w:r>
           </w:p>
         </w:tc>
@@ -4601,7 +4601,7 @@
           <w:rFonts w:ascii="Calibri" w:hAnsi="Calibri"/>
           <w:color w:val="111827"/>
         </w:rPr>
-        <w:t>$50.6K of advertising cost equals 98.7% of CM1. Ingest campaign and advertised-SKU detail, then govern spend to CM after ads rather than revenue or ROAS alone.</w:t>
+        <w:t>$50.6K of advertising cost equals 98.7% of contribution margin. Ingest campaign and advertised-SKU detail, then evaluate spend against profit after advertising rather than revenue or ROAS alone.</w:t>
       </w:r>
     </w:p>
     <w:p>
@@ -5329,17 +5329,12 @@
       </w:r>
     </w:p>
     <w:p>
-      <w:r>
-        <w:br w:type="page"/>
-      </w:r>
-    </w:p>
-    <w:p>
       <w:pPr>
         <w:pStyle w:val="Heading1"/>
         <w:keepNext/>
       </w:pPr>
       <w:r>
-        <w:t>3. First 90 days: automate trust, then decisions</w:t>
+        <w:t>3. First 90 days: proposed order of work</w:t>
       </w:r>
     </w:p>
     <w:p>
@@ -5351,7 +5346,7 @@
           <w:rFonts w:ascii="Calibri" w:hAnsi="Calibri"/>
           <w:color w:val="111827"/>
         </w:rPr>
-        <w:t>The sequence is the same under either platform option: control source delivery first, automate the management P&amp;L second, and add inventory/ad actions third.</w:t>
+        <w:t>I would make source delivery and reconciliation repeatable first, automate the management P&amp;L second, and add inventory and advertising actions third.</w:t>
       </w:r>
     </w:p>
     <w:tbl>
@@ -5501,7 +5496,7 @@
                 <w:color w:val="111827"/>
                 <w:sz w:val="18"/>
               </w:rPr>
-              <w:t>Schedule QuickBooks, REACH, Amazon, and Sheet loads; immutable replayable Bronze data; identity/UOM governance; schema-drift, dedup, freshness, and amount gates.</w:t>
+              <w:t>Schedule QuickBooks, REACH, Amazon, and Sheet loads; preserve raw history; add product/UOM mappings, schema-change alerts, duplicate rules, and amount checks.</w:t>
             </w:r>
           </w:p>
         </w:tc>
@@ -5526,7 +5521,7 @@
                 <w:color w:val="111827"/>
                 <w:sz w:val="18"/>
               </w:rPr>
-              <w:t>Daily source-control dashboard, drift alerts, and owned exception queue.</w:t>
+              <w:t>Daily load status, drift alerts, and a review list for failed records.</w:t>
             </w:r>
           </w:p>
         </w:tc>
@@ -5580,7 +5575,7 @@
                 <w:color w:val="111827"/>
                 <w:sz w:val="18"/>
               </w:rPr>
-              <w:t>Build Silver facts and Gold brand/SKU CM; reconcile Amazon settlements to QuickBooks; replace copy/paste reporting.</w:t>
+              <w:t>Build the brand/SKU contribution-margin tables; reconcile Amazon settlements to QuickBooks; replace copy-and-paste reporting.</w:t>
             </w:r>
           </w:p>
         </w:tc>
@@ -5606,7 +5601,7 @@
                 <w:color w:val="111827"/>
                 <w:sz w:val="18"/>
               </w:rPr>
-              <w:t>Close-ready channel P&amp;L and settlement-to-GL reconciliation.</w:t>
+              <w:t>Repeatable channel P&amp;L and settlement-to-GL reconciliation.</w:t>
             </w:r>
           </w:p>
         </w:tc>
@@ -5658,7 +5653,7 @@
                 <w:color w:val="111827"/>
                 <w:sz w:val="18"/>
               </w:rPr>
-              <w:t>Add REACH PO lifecycle/receipts, inventory alerts, campaign-SKU spend, and 13-week cash/inventory outlook.</w:t>
+              <w:t>Add REACH PO status and receipts, inventory alerts, campaign/SKU spend, and a 13-week cash and inventory outlook.</w:t>
             </w:r>
           </w:p>
         </w:tc>
@@ -5683,7 +5678,7 @@
                 <w:color w:val="111827"/>
                 <w:sz w:val="18"/>
               </w:rPr>
-              <w:t>Forward-looking actions grounded in controlled facts.</w:t>
+              <w:t>Inventory and advertising actions based on better source detail.</w:t>
             </w:r>
           </w:p>
         </w:tc>
@@ -6538,7 +6533,7 @@
                 <w:color w:val="111827"/>
                 <w:sz w:val="18"/>
               </w:rPr>
-              <w:t>Kept these amounts below SKU-attributable CM1; did not force an allocation.</w:t>
+              <w:t>Kept these amounts below SKU-attributable contribution margin; did not force an allocation.</w:t>
             </w:r>
           </w:p>
         </w:tc>
@@ -6804,7 +6799,7 @@
           <w:rFonts w:ascii="Calibri" w:hAnsi="Calibri"/>
           <w:color w:val="111827"/>
         </w:rPr>
-        <w:t>AI was used to accelerate data profiling, draft reproducible transformation code, propose the dimensional model, and format the workbook, document, and deck. All calculations were independently reconciled to the supplied CSV files using explicit arithmetic checks. Every material assumption or imputation is surfaced in the data-quality register. No external factual data was introduced into the profitability calculation.</w:t>
+        <w:t>I used AI to help profile the files, draft portions of the Python and SQL, and format the workbook, written response, and presentation. I reviewed the transformation logic, tied the outputs back to the supplied files, and kept all assumptions and imputed values visible. I did not use external operating or financial data in the profitability calculation.</w:t>
       </w:r>
     </w:p>
     <w:p>

</xml_diff>